<commit_message>
Add the instructor orientation and the post-assignment survey
The orientation covers the case, the three variations, running the case,
what the pilots showed, the five data problems plus the repeated-address
double records, grading, debrief questions, running the variations as a
comparison, and the reference sites. Its text lives in a template, and
run_all.py fills in all 43 data figures from the reference code. The
survey follows Appendix B and is the same in every variation.

Co-Authored-By: Claude Opus 5.5 <noreply@anthropic.com>
Claude-Session: https://claude.ai/code/session_01QswSU6wxkqJuqxcnQwcroZ
</commit_message>
<xml_diff>
--- a/output/instructor/Variation 2 Answer Key.docx
+++ b/output/instructor/Variation 2 Answer Key.docx
@@ -24736,7 +24736,7 @@
         </w:numPr>
         <w:spacing w:after="80"/>
       </w:pPr>
-      <w:hyperlink w:history="1" r:id="rId5txmxizv49ntbfxpa0l_o">
+      <w:hyperlink w:history="1" r:id="rIdt00_a5ysxo4ngxsqfumtq">
         <w:r>
           <w:rPr>
             <w:color w:val="1F5FAD"/>
@@ -24758,7 +24758,7 @@
         </w:numPr>
         <w:spacing w:after="80"/>
       </w:pPr>
-      <w:hyperlink w:history="1" r:id="rIdydnctxpv_vttvx2c6vmol">
+      <w:hyperlink w:history="1" r:id="rIdcrhuzi1h-o05kodt4ksmc">
         <w:r>
           <w:rPr>
             <w:color w:val="1F5FAD"/>
@@ -24780,7 +24780,7 @@
         </w:numPr>
         <w:spacing w:after="80"/>
       </w:pPr>
-      <w:hyperlink w:history="1" r:id="rIdvab0sujuh58yqpxkhggdd">
+      <w:hyperlink w:history="1" r:id="rIdfamu6qcxvnsbd-xhqtu5y">
         <w:r>
           <w:rPr>
             <w:color w:val="1F5FAD"/>
@@ -24802,7 +24802,7 @@
         </w:numPr>
         <w:spacing w:after="80"/>
       </w:pPr>
-      <w:hyperlink w:history="1" r:id="rIdf4g_heqbmmtjqju0ln90a">
+      <w:hyperlink w:history="1" r:id="rIdbst6dqyme5yji5vzup8jw">
         <w:r>
           <w:rPr>
             <w:color w:val="1F5FAD"/>

</xml_diff>